<commit_message>
feat: agregar ordenamiento por columna y mejorar etiquetas de graficas en reportes
- Nuevo trait Sortable con lista blanca de columnas para citas, barberos,
  clientes, productos, pagos, pedidos y usuarios
- Componente x-sortable-th para encabezados de tabla clicables
- Ejes con titulo y formato de moneda en graficas de Excel/PDF/dashboard
- Fix: restaurar celda de nombre/avatar de usuario en la tabla de usuarios
</commit_message>
<xml_diff>
--- a/docs/word/UrbanBlade_Documentacion_Tecnica.docx
+++ b/docs/word/UrbanBlade_Documentacion_Tecnica.docx
@@ -51,7 +51,7 @@
           <w:sz w:val="26"/>
           <w:szCs w:val="26"/>
         </w:rPr>
-        <w:t xml:space="preserve">Sistema de gestión de barbería + módulo de analítica Big Data</w:t>
+        <w:t xml:space="preserve">Sistema de gestión de barbería con módulo de analítica avanzada integrado</w:t>
       </w:r>
     </w:p>
     <w:p>
@@ -65,7 +65,7 @@
           <w:sz w:val="22"/>
           <w:szCs w:val="22"/>
         </w:rPr>
-        <w:t xml:space="preserve">Aplicación web (Laravel 12 + MongoDB) y módulo de analítica (PySpark)</w:t>
+        <w:t xml:space="preserve">Aplicación web (Laravel 12 + MongoDB) con módulo de analítica avanzada integrado</w:t>
       </w:r>
     </w:p>
     <w:p>
@@ -93,7 +93,7 @@
           <w:sz w:val="22"/>
           <w:szCs w:val="22"/>
         </w:rPr>
-        <w:t xml:space="preserve">15 de julio de 2026</w:t>
+        <w:t xml:space="preserve">07 de agosto de 2026</w:t>
       </w:r>
     </w:p>
     <w:p>
@@ -146,7 +146,7 @@
         <w:spacing w:after="160"/>
       </w:pPr>
       <w:r>
-        <w:t xml:space="preserve">UrbanBlade está compuesto por dos proyectos independientes que comparten la misma base de datos MongoDB Atlas, pero corren en entornos separados.</w:t>
+        <w:t xml:space="preserve">UrbanBlade es un único proyecto (aplicación web Laravel) que corre sobre MongoDB Atlas e incluye, integrado en la misma base de código, un módulo de analítica avanzada — antes desarrollado como un proyecto aparte y ya incorporado por completo a la aplicación principal.</w:t>
       </w:r>
     </w:p>
     <w:tbl>
@@ -334,53 +334,53 @@
                 <w:sz w:val="20"/>
                 <w:szCs w:val="20"/>
               </w:rPr>
-              <w:t xml:space="preserve">spark/</w:t>
-            </w:r>
-          </w:p>
-        </w:tc>
-        <w:tc>
-          <w:tcPr>
-            <w:tcW w:type="auto" w:w="0"/>
-            <w:tcMar>
-              <w:top w:type="dxa" w:w="80"/>
-              <w:left w:type="dxa" w:w="120"/>
-              <w:bottom w:type="dxa" w:w="80"/>
-              <w:right w:type="dxa" w:w="120"/>
-            </w:tcMar>
-          </w:tcPr>
-          <w:p>
-            <w:r>
-              <w:rPr>
-                <w:b w:val="false"/>
-                <w:bCs w:val="false"/>
-                <w:color w:val="000000"/>
-                <w:sz w:val="20"/>
-                <w:szCs w:val="20"/>
-              </w:rPr>
-              <w:t xml:space="preserve">KikeGonRam/spark (rama urbanblade-analytics)</w:t>
-            </w:r>
-          </w:p>
-        </w:tc>
-        <w:tc>
-          <w:tcPr>
-            <w:tcW w:type="auto" w:w="0"/>
-            <w:tcMar>
-              <w:top w:type="dxa" w:w="80"/>
-              <w:left w:type="dxa" w:w="120"/>
-              <w:bottom w:type="dxa" w:w="80"/>
-              <w:right w:type="dxa" w:w="120"/>
-            </w:tcMar>
-          </w:tcPr>
-          <w:p>
-            <w:r>
-              <w:rPr>
-                <w:b w:val="false"/>
-                <w:bCs w:val="false"/>
-                <w:color w:val="000000"/>
-                <w:sz w:val="20"/>
-                <w:szCs w:val="20"/>
-              </w:rPr>
-              <w:t xml:space="preserve">Módulo de analítica Big Data (PySpark), solo lectura sobre la misma base</w:t>
+              <w:t xml:space="preserve">analítica/</w:t>
+            </w:r>
+          </w:p>
+        </w:tc>
+        <w:tc>
+          <w:tcPr>
+            <w:tcW w:type="auto" w:w="0"/>
+            <w:tcMar>
+              <w:top w:type="dxa" w:w="80"/>
+              <w:left w:type="dxa" w:w="120"/>
+              <w:bottom w:type="dxa" w:w="80"/>
+              <w:right w:type="dxa" w:w="120"/>
+            </w:tcMar>
+          </w:tcPr>
+          <w:p>
+            <w:r>
+              <w:rPr>
+                <w:b w:val="false"/>
+                <w:bCs w:val="false"/>
+                <w:color w:val="000000"/>
+                <w:sz w:val="20"/>
+                <w:szCs w:val="20"/>
+              </w:rPr>
+              <w:t xml:space="preserve">KikeGonRam/barber (mismo repo, ya integrado)</w:t>
+            </w:r>
+          </w:p>
+        </w:tc>
+        <w:tc>
+          <w:tcPr>
+            <w:tcW w:type="auto" w:w="0"/>
+            <w:tcMar>
+              <w:top w:type="dxa" w:w="80"/>
+              <w:left w:type="dxa" w:w="120"/>
+              <w:bottom w:type="dxa" w:w="80"/>
+              <w:right w:type="dxa" w:w="120"/>
+            </w:tcMar>
+          </w:tcPr>
+          <w:p>
+            <w:r>
+              <w:rPr>
+                <w:b w:val="false"/>
+                <w:bCs w:val="false"/>
+                <w:color w:val="000000"/>
+                <w:sz w:val="20"/>
+                <w:szCs w:val="20"/>
+              </w:rPr>
+              <w:t xml:space="preserve">Módulo de analítica avanzada, accesible en /analitica dentro de la misma app</w:t>
             </w:r>
           </w:p>
         </w:tc>
@@ -1031,6 +1031,14 @@
     </w:p>
     <w:p>
       <w:pPr>
+        <w:spacing w:after="160"/>
+      </w:pPr>
+      <w:r>
+        <w:t xml:space="preserve">Verificación de cuenta:   el registro ya no envía un enlace firmado (flujo por defecto de Laravel Breeze). En su lugar, User::sendEmailVerificationNotification() está sobrescrito para generar un código numérico de 6 dígitos con 10 minutos de vigencia (campos verification_code / verification_code_expires_at en el propio documento del usuario), enviado con EmailVerificationCodeNotification y validado por VerifyEmailCodeController — sin exponer un token en la URL.</w:t>
+      </w:r>
+    </w:p>
+    <w:p>
+      <w:pPr>
         <w:pStyle w:val="Heading2"/>
       </w:pPr>
       <w:r>
@@ -1487,6 +1495,22 @@
     </w:p>
     <w:p>
       <w:pPr>
+        <w:pStyle w:val="Heading3"/>
+      </w:pPr>
+      <w:r>
+        <w:t xml:space="preserve">Reportes con gráficas</w:t>
+      </w:r>
+    </w:p>
+    <w:p>
+      <w:pPr>
+        <w:spacing w:after="160"/>
+      </w:pPr>
+      <w:r>
+        <w:t xml:space="preserve">El centro de reportes (ReportService::reportByType()) ya no exporta solo tablas: cada tipo de reporte (ingresos, citas, inventario, clientes) calcula también un bloque chart (labels/values) que se reutiliza en tres salidas — una gráfica Chart.js en la vista previa web, un gráfico de barras nativo embebido en el Excel exportado (GenericReportExport, vía PhpSpreadsheet/WithCharts) y un gráfico dibujado en HTML/CSS puro dentro del PDF (DomPDF no ejecuta JavaScript, por lo que no puede usar Chart.js), manteniendo la paleta de marca (dorado #D4AF37 sobre fondo oscuro) en las tres.</w:t>
+      </w:r>
+    </w:p>
+    <w:p>
+      <w:pPr>
         <w:pStyle w:val="Heading2"/>
       </w:pPr>
       <w:r>
@@ -1619,59 +1643,6 @@
     </w:p>
     <w:p>
       <w:pPr>
-        <w:pStyle w:val="Heading2"/>
-      </w:pPr>
-      <w:r>
-        <w:t xml:space="preserve">2.7 Estado de pruebas</w:t>
-      </w:r>
-    </w:p>
-    <w:p>
-      <w:pPr>
-        <w:spacing w:after="160"/>
-      </w:pPr>
-      <w:r>
-        <w:t xml:space="preserve">El proyecto no cuenta actualmente con un directorio tests/ ni suite de pruebas automatizadas activa. Cualquier verificación de cambios se hace manualmente (navegador + revisión de logs de Docker).</w:t>
-      </w:r>
-    </w:p>
-    <w:p>
-      <w:r>
-        <w:br w:type="page"/>
-      </w:r>
-    </w:p>
-    <w:p>
-      <w:pPr>
-        <w:pStyle w:val="Heading1"/>
-      </w:pPr>
-      <w:r>
-        <w:t xml:space="preserve">3. Módulo de analítica (spark/)</w:t>
-      </w:r>
-    </w:p>
-    <w:p>
-      <w:pPr>
-        <w:pStyle w:val="Heading2"/>
-      </w:pPr>
-      <w:r>
-        <w:t xml:space="preserve">3.1 Propósito y contexto académico</w:t>
-      </w:r>
-    </w:p>
-    <w:p>
-      <w:pPr>
-        <w:spacing w:after="160"/>
-      </w:pPr>
-      <w:r>
-        <w:t xml:space="preserve">spark/ es un proyecto independiente de la materia Extracción del conocimiento en bases de datos (UTVT IDGS-93). No es parte de la app en producción — es un módulo de analítica que lee la misma base MongoDB Atlas en modo solo lectura y aplica las técnicas de las 5 unidades del programa: introducción, preparación de datos (ETL/MapReduce), aprendizaje supervisado, aprendizaje no supervisado y visualización.</w:t>
-      </w:r>
-    </w:p>
-    <w:p>
-      <w:pPr>
-        <w:pStyle w:val="Heading2"/>
-      </w:pPr>
-      <w:r>
-        <w:t xml:space="preserve">3.2 Stack y entorno</w:t>
-      </w:r>
-    </w:p>
-    <w:p>
-      <w:pPr>
         <w:pStyle w:val="ListParagraph"/>
         <w:numPr>
           <w:ilvl w:val="0"/>
@@ -1680,7 +1651,68 @@
         <w:spacing w:after="80"/>
       </w:pPr>
       <w:r>
-        <w:t xml:space="preserve">PySpark 3.5.1, PyMongo 4.7.2, Python 3.11 (vía Miniconda, entorno spark_env)</w:t>
+        <w:t xml:space="preserve">Página pública (/):   siete secciones — Inicio, Servicios, Proceso, Maestros, Ubicación, Acceso y Reservar. La sección Ubicación incluye un mapa real embebido (iframe de OpenStreetMap centrado en la dirección configurada) y un enlace a Google Maps, en vez de un marcador estático. Los datos de servicios, barberos y estadísticas globales que alimentan esta página se cachean 5 minutos (Cache::remember en routes/web.php) para no recalcularlos en cada visita anónima.</w:t>
+      </w:r>
+    </w:p>
+    <w:p>
+      <w:pPr>
+        <w:pStyle w:val="Heading2"/>
+      </w:pPr>
+      <w:r>
+        <w:t xml:space="preserve">2.7 Estado de pruebas</w:t>
+      </w:r>
+    </w:p>
+    <w:p>
+      <w:pPr>
+        <w:spacing w:after="160"/>
+      </w:pPr>
+      <w:r>
+        <w:t xml:space="preserve">El proyecto no cuenta actualmente con un directorio tests/ ni suite de pruebas automatizadas activa. Cualquier verificación de cambios se hace manualmente (navegador + revisión de logs de Docker).</w:t>
+      </w:r>
+    </w:p>
+    <w:p>
+      <w:r>
+        <w:br w:type="page"/>
+      </w:r>
+    </w:p>
+    <w:p>
+      <w:pPr>
+        <w:pStyle w:val="Heading1"/>
+      </w:pPr>
+      <w:r>
+        <w:t xml:space="preserve">3. Módulo de analítica avanzada</w:t>
+      </w:r>
+    </w:p>
+    <w:p>
+      <w:pPr>
+        <w:pStyle w:val="Heading2"/>
+      </w:pPr>
+      <w:r>
+        <w:t xml:space="preserve">3.1 Qué es y cómo se accede</w:t>
+      </w:r>
+    </w:p>
+    <w:p>
+      <w:pPr>
+        <w:spacing w:after="160"/>
+      </w:pPr>
+      <w:r>
+        <w:t xml:space="preserve">Es una sección más de la aplicación Laravel, no un proyecto aparte: se accede desde el menú (Analítica, ruta /analitica) y la resuelve AnalyticsController, que arma la pantalla según el rol de quien la visita — mismo patrón de autenticación y permisos que el resto del sistema.</w:t>
+      </w:r>
+    </w:p>
+    <w:p>
+      <w:pPr>
+        <w:pStyle w:val="Heading2"/>
+      </w:pPr>
+      <w:r>
+        <w:t xml:space="preserve">3.2 Cómo está organizada la información</w:t>
+      </w:r>
+    </w:p>
+    <w:p>
+      <w:pPr>
+        <w:spacing w:after="160"/>
+      </w:pPr>
+      <w:r>
+        <w:t xml:space="preserve">Los hallazgos se agrupan por intención de negocio, no por tema académico, para que cualquier usuario entienda de un vistazo qué puede hacer con cada dato:</w:t>
       </w:r>
     </w:p>
     <w:p>
@@ -1693,7 +1725,7 @@
         <w:spacing w:after="80"/>
       </w:pPr>
       <w:r>
-        <w:t xml:space="preserve">Streamlit + Plotly para los dashboards interactivos</w:t>
+        <w:t xml:space="preserve">Resumen ejecutivo — el pulso general del negocio.</w:t>
       </w:r>
     </w:p>
     <w:p>
@@ -1706,7 +1738,7 @@
         <w:spacing w:after="80"/>
       </w:pPr>
       <w:r>
-        <w:t xml:space="preserve">PyTorch + scikit-learn para el módulo de red neuronal</w:t>
+        <w:t xml:space="preserve">Operación y equipo — agenda, ventas e inventario.</w:t>
       </w:r>
     </w:p>
     <w:p>
@@ -1719,7 +1751,28 @@
         <w:spacing w:after="80"/>
       </w:pPr>
       <w:r>
-        <w:t xml:space="preserve">Corre en WSL Ubuntu (no en Docker); el proyecto se monta automáticamente en /mnt/c/...</w:t>
+        <w:t xml:space="preserve">Clientes y ventas — quiénes vuelven, quiénes podrían dejar de venir, qué se vende más.</w:t>
+      </w:r>
+    </w:p>
+    <w:p>
+      <w:pPr>
+        <w:pStyle w:val="ListParagraph"/>
+        <w:numPr>
+          <w:ilvl w:val="0"/>
+          <w:numId w:val="2"/>
+        </w:numPr>
+        <w:spacing w:after="80"/>
+      </w:pPr>
+      <w:r>
+        <w:t xml:space="preserve">Predicción y cancelaciones — estimaciones de demanda y riesgo de cancelación.</w:t>
+      </w:r>
+    </w:p>
+    <w:p>
+      <w:pPr>
+        <w:spacing w:after="160"/>
+      </w:pPr>
+      <w:r>
+        <w:t xml:space="preserve">Cada rol ve solo el recorte que le corresponde (AnalyticsInsightService::forAdmin() / forReception() / forBarber() / forClient()) — un barbero, por ejemplo, nunca ve los insights privados de otro barbero.</w:t>
       </w:r>
     </w:p>
     <w:p>
@@ -1727,7 +1780,7 @@
         <w:pStyle w:val="Heading2"/>
       </w:pPr>
       <w:r>
-        <w:t xml:space="preserve">3.3 Capa de datos central</w:t>
+        <w:t xml:space="preserve">3.3 De dónde salen los hallazgos</w:t>
       </w:r>
     </w:p>
     <w:p>
@@ -1735,463 +1788,9 @@
         <w:spacing w:after="160"/>
       </w:pPr>
       <w:r>
-        <w:t xml:space="preserve">config/mongo_spark_conexion_sinnulos.py es el módulo del que dependen todos los scripts. En vez de usar el conector nativo Spark-MongoDB, hace un JOIN en memoria vía PyMongo entre appointments → services → barbers → users → clients → users, arma un DataFrame de Spark con las columnas ya resueltas y expone get_spark_session() → (spark, df, df_vector).</w:t>
-      </w:r>
-    </w:p>
-    <w:tbl>
-      <w:tblPr>
-        <w:tblW w:type="dxa" w:w="9560"/>
-        <w:tblBorders>
-          <w:top w:val="single" w:color="auto" w:sz="4"/>
-          <w:left w:val="single" w:color="auto" w:sz="4"/>
-          <w:bottom w:val="single" w:color="auto" w:sz="4"/>
-          <w:right w:val="single" w:color="auto" w:sz="4"/>
-          <w:insideH w:val="single" w:color="auto" w:sz="4"/>
-          <w:insideV w:val="single" w:color="auto" w:sz="4"/>
-        </w:tblBorders>
-      </w:tblPr>
-      <w:tblGrid>
-        <w:gridCol w:w="3200"/>
-        <w:gridCol w:w="6360"/>
-      </w:tblGrid>
-      <w:tr>
-        <w:trPr>
-          <w:tblHeader/>
-        </w:trPr>
-        <w:tc>
-          <w:tcPr>
-            <w:tcW w:type="auto" w:w="0"/>
-            <w:shd w:fill="1A1A1A" w:val="clear"/>
-            <w:tcMar>
-              <w:top w:type="dxa" w:w="80"/>
-              <w:left w:type="dxa" w:w="120"/>
-              <w:bottom w:type="dxa" w:w="80"/>
-              <w:right w:type="dxa" w:w="120"/>
-            </w:tcMar>
-          </w:tcPr>
-          <w:p>
-            <w:r>
-              <w:rPr>
-                <w:b/>
-                <w:bCs/>
-                <w:color w:val="FFFFFF"/>
-                <w:sz w:val="20"/>
-                <w:szCs w:val="20"/>
-              </w:rPr>
-              <w:t xml:space="preserve">Helper</w:t>
-            </w:r>
-          </w:p>
-        </w:tc>
-        <w:tc>
-          <w:tcPr>
-            <w:tcW w:type="auto" w:w="0"/>
-            <w:shd w:fill="1A1A1A" w:val="clear"/>
-            <w:tcMar>
-              <w:top w:type="dxa" w:w="80"/>
-              <w:left w:type="dxa" w:w="120"/>
-              <w:bottom w:type="dxa" w:w="80"/>
-              <w:right w:type="dxa" w:w="120"/>
-            </w:tcMar>
-          </w:tcPr>
-          <w:p>
-            <w:r>
-              <w:rPr>
-                <w:b/>
-                <w:bCs/>
-                <w:color w:val="FFFFFF"/>
-                <w:sz w:val="20"/>
-                <w:szCs w:val="20"/>
-              </w:rPr>
-              <w:t xml:space="preserve">Qué devuelve</w:t>
-            </w:r>
-          </w:p>
-        </w:tc>
-      </w:tr>
-      <w:tr>
-        <w:tc>
-          <w:tcPr>
-            <w:tcW w:type="auto" w:w="0"/>
-            <w:tcMar>
-              <w:top w:type="dxa" w:w="80"/>
-              <w:left w:type="dxa" w:w="120"/>
-              <w:bottom w:type="dxa" w:w="80"/>
-              <w:right w:type="dxa" w:w="120"/>
-            </w:tcMar>
-          </w:tcPr>
-          <w:p>
-            <w:r>
-              <w:rPr>
-                <w:b w:val="false"/>
-                <w:bCs w:val="false"/>
-                <w:color w:val="000000"/>
-                <w:sz w:val="20"/>
-                <w:szCs w:val="20"/>
-              </w:rPr>
-              <w:t xml:space="preserve">get_clientes_df</w:t>
-            </w:r>
-          </w:p>
-        </w:tc>
-        <w:tc>
-          <w:tcPr>
-            <w:tcW w:type="auto" w:w="0"/>
-            <w:tcMar>
-              <w:top w:type="dxa" w:w="80"/>
-              <w:left w:type="dxa" w:w="120"/>
-              <w:bottom w:type="dxa" w:w="80"/>
-              <w:right w:type="dxa" w:w="120"/>
-            </w:tcMar>
-          </w:tcPr>
-          <w:p>
-            <w:r>
-              <w:rPr>
-                <w:b w:val="false"/>
-                <w:bCs w:val="false"/>
-                <w:color w:val="000000"/>
-                <w:sz w:val="20"/>
-                <w:szCs w:val="20"/>
-              </w:rPr>
-              <w:t xml:space="preserve">Perfil RFM (recencia/frecuencia/monto) por cliente</w:t>
-            </w:r>
-          </w:p>
-        </w:tc>
-      </w:tr>
-      <w:tr>
-        <w:tc>
-          <w:tcPr>
-            <w:tcW w:type="auto" w:w="0"/>
-            <w:tcMar>
-              <w:top w:type="dxa" w:w="80"/>
-              <w:left w:type="dxa" w:w="120"/>
-              <w:bottom w:type="dxa" w:w="80"/>
-              <w:right w:type="dxa" w:w="120"/>
-            </w:tcMar>
-          </w:tcPr>
-          <w:p>
-            <w:r>
-              <w:rPr>
-                <w:b w:val="false"/>
-                <w:bCs w:val="false"/>
-                <w:color w:val="000000"/>
-                <w:sz w:val="20"/>
-                <w:szCs w:val="20"/>
-              </w:rPr>
-              <w:t xml:space="preserve">get_pagos_df</w:t>
-            </w:r>
-          </w:p>
-        </w:tc>
-        <w:tc>
-          <w:tcPr>
-            <w:tcW w:type="auto" w:w="0"/>
-            <w:tcMar>
-              <w:top w:type="dxa" w:w="80"/>
-              <w:left w:type="dxa" w:w="120"/>
-              <w:bottom w:type="dxa" w:w="80"/>
-              <w:right w:type="dxa" w:w="120"/>
-            </w:tcMar>
-          </w:tcPr>
-          <w:p>
-            <w:r>
-              <w:rPr>
-                <w:b w:val="false"/>
-                <w:bCs w:val="false"/>
-                <w:color w:val="000000"/>
-                <w:sz w:val="20"/>
-                <w:szCs w:val="20"/>
-              </w:rPr>
-              <w:t xml:space="preserve">Pagos reconciliados contra citas + quién cobró</w:t>
-            </w:r>
-          </w:p>
-        </w:tc>
-      </w:tr>
-      <w:tr>
-        <w:tc>
-          <w:tcPr>
-            <w:tcW w:type="auto" w:w="0"/>
-            <w:tcMar>
-              <w:top w:type="dxa" w:w="80"/>
-              <w:left w:type="dxa" w:w="120"/>
-              <w:bottom w:type="dxa" w:w="80"/>
-              <w:right w:type="dxa" w:w="120"/>
-            </w:tcMar>
-          </w:tcPr>
-          <w:p>
-            <w:r>
-              <w:rPr>
-                <w:b w:val="false"/>
-                <w:bCs w:val="false"/>
-                <w:color w:val="000000"/>
-                <w:sz w:val="20"/>
-                <w:szCs w:val="20"/>
-              </w:rPr>
-              <w:t xml:space="preserve">get_loyalty_df</w:t>
-            </w:r>
-          </w:p>
-        </w:tc>
-        <w:tc>
-          <w:tcPr>
-            <w:tcW w:type="auto" w:w="0"/>
-            <w:tcMar>
-              <w:top w:type="dxa" w:w="80"/>
-              <w:left w:type="dxa" w:w="120"/>
-              <w:bottom w:type="dxa" w:w="80"/>
-              <w:right w:type="dxa" w:w="120"/>
-            </w:tcMar>
-          </w:tcPr>
-          <w:p>
-            <w:r>
-              <w:rPr>
-                <w:b w:val="false"/>
-                <w:bCs w:val="false"/>
-                <w:color w:val="000000"/>
-                <w:sz w:val="20"/>
-                <w:szCs w:val="20"/>
-              </w:rPr>
-              <w:t xml:space="preserve">Puntos de lealtad por cliente/mes/nivel</w:t>
-            </w:r>
-          </w:p>
-        </w:tc>
-      </w:tr>
-      <w:tr>
-        <w:tc>
-          <w:tcPr>
-            <w:tcW w:type="auto" w:w="0"/>
-            <w:tcMar>
-              <w:top w:type="dxa" w:w="80"/>
-              <w:left w:type="dxa" w:w="120"/>
-              <w:bottom w:type="dxa" w:w="80"/>
-              <w:right w:type="dxa" w:w="120"/>
-            </w:tcMar>
-          </w:tcPr>
-          <w:p>
-            <w:r>
-              <w:rPr>
-                <w:b w:val="false"/>
-                <w:bCs w:val="false"/>
-                <w:color w:val="000000"/>
-                <w:sz w:val="20"/>
-                <w:szCs w:val="20"/>
-              </w:rPr>
-              <w:t xml:space="preserve">get_horarios_df / get_utilizacion_barberos_df</w:t>
-            </w:r>
-          </w:p>
-        </w:tc>
-        <w:tc>
-          <w:tcPr>
-            <w:tcW w:type="auto" w:w="0"/>
-            <w:tcMar>
-              <w:top w:type="dxa" w:w="80"/>
-              <w:left w:type="dxa" w:w="120"/>
-              <w:bottom w:type="dxa" w:w="80"/>
-              <w:right w:type="dxa" w:w="120"/>
-            </w:tcMar>
-          </w:tcPr>
-          <w:p>
-            <w:r>
-              <w:rPr>
-                <w:b w:val="false"/>
-                <w:bCs w:val="false"/>
-                <w:color w:val="000000"/>
-                <w:sz w:val="20"/>
-                <w:szCs w:val="20"/>
-              </w:rPr>
-              <w:t xml:space="preserve">Horas disponibles vs. ocupadas por barbero</w:t>
-            </w:r>
-          </w:p>
-        </w:tc>
-      </w:tr>
-      <w:tr>
-        <w:tc>
-          <w:tcPr>
-            <w:tcW w:type="auto" w:w="0"/>
-            <w:tcMar>
-              <w:top w:type="dxa" w:w="80"/>
-              <w:left w:type="dxa" w:w="120"/>
-              <w:bottom w:type="dxa" w:w="80"/>
-              <w:right w:type="dxa" w:w="120"/>
-            </w:tcMar>
-          </w:tcPr>
-          <w:p>
-            <w:r>
-              <w:rPr>
-                <w:b w:val="false"/>
-                <w:bCs w:val="false"/>
-                <w:color w:val="000000"/>
-                <w:sz w:val="20"/>
-                <w:szCs w:val="20"/>
-              </w:rPr>
-              <w:t xml:space="preserve">get_productos_df</w:t>
-            </w:r>
-          </w:p>
-        </w:tc>
-        <w:tc>
-          <w:tcPr>
-            <w:tcW w:type="auto" w:w="0"/>
-            <w:tcMar>
-              <w:top w:type="dxa" w:w="80"/>
-              <w:left w:type="dxa" w:w="120"/>
-              <w:bottom w:type="dxa" w:w="80"/>
-              <w:right w:type="dxa" w:w="120"/>
-            </w:tcMar>
-          </w:tcPr>
-          <w:p>
-            <w:r>
-              <w:rPr>
-                <w:b w:val="false"/>
-                <w:bCs w:val="false"/>
-                <w:color w:val="000000"/>
-                <w:sz w:val="20"/>
-                <w:szCs w:val="20"/>
-              </w:rPr>
-              <w:t xml:space="preserve">Inventario con márgenes y alertas de reorden</w:t>
-            </w:r>
-          </w:p>
-        </w:tc>
-      </w:tr>
-      <w:tr>
-        <w:tc>
-          <w:tcPr>
-            <w:tcW w:type="auto" w:w="0"/>
-            <w:tcMar>
-              <w:top w:type="dxa" w:w="80"/>
-              <w:left w:type="dxa" w:w="120"/>
-              <w:bottom w:type="dxa" w:w="80"/>
-              <w:right w:type="dxa" w:w="120"/>
-            </w:tcMar>
-          </w:tcPr>
-          <w:p>
-            <w:r>
-              <w:rPr>
-                <w:b w:val="false"/>
-                <w:bCs w:val="false"/>
-                <w:color w:val="000000"/>
-                <w:sz w:val="20"/>
-                <w:szCs w:val="20"/>
-              </w:rPr>
-              <w:t xml:space="preserve">get_pedidos_df</w:t>
-            </w:r>
-          </w:p>
-        </w:tc>
-        <w:tc>
-          <w:tcPr>
-            <w:tcW w:type="auto" w:w="0"/>
-            <w:tcMar>
-              <w:top w:type="dxa" w:w="80"/>
-              <w:left w:type="dxa" w:w="120"/>
-              <w:bottom w:type="dxa" w:w="80"/>
-              <w:right w:type="dxa" w:w="120"/>
-            </w:tcMar>
-          </w:tcPr>
-          <w:p>
-            <w:r>
-              <w:rPr>
-                <w:b w:val="false"/>
-                <w:bCs w:val="false"/>
-                <w:color w:val="000000"/>
-                <w:sz w:val="20"/>
-                <w:szCs w:val="20"/>
-              </w:rPr>
-              <w:t xml:space="preserve">Un pedido por fila (orders: tipo, estado, total)</w:t>
-            </w:r>
-          </w:p>
-        </w:tc>
-      </w:tr>
-      <w:tr>
-        <w:tc>
-          <w:tcPr>
-            <w:tcW w:type="auto" w:w="0"/>
-            <w:tcMar>
-              <w:top w:type="dxa" w:w="80"/>
-              <w:left w:type="dxa" w:w="120"/>
-              <w:bottom w:type="dxa" w:w="80"/>
-              <w:right w:type="dxa" w:w="120"/>
-            </w:tcMar>
-          </w:tcPr>
-          <w:p>
-            <w:r>
-              <w:rPr>
-                <w:b w:val="false"/>
-                <w:bCs w:val="false"/>
-                <w:color w:val="000000"/>
-                <w:sz w:val="20"/>
-                <w:szCs w:val="20"/>
-              </w:rPr>
-              <w:t xml:space="preserve">get_top_productos_df</w:t>
-            </w:r>
-          </w:p>
-        </w:tc>
-        <w:tc>
-          <w:tcPr>
-            <w:tcW w:type="auto" w:w="0"/>
-            <w:tcMar>
-              <w:top w:type="dxa" w:w="80"/>
-              <w:left w:type="dxa" w:w="120"/>
-              <w:bottom w:type="dxa" w:w="80"/>
-              <w:right w:type="dxa" w:w="120"/>
-            </w:tcMar>
-          </w:tcPr>
-          <w:p>
-            <w:r>
-              <w:rPr>
-                <w:b w:val="false"/>
-                <w:bCs w:val="false"/>
-                <w:color w:val="000000"/>
-                <w:sz w:val="20"/>
-                <w:szCs w:val="20"/>
-              </w:rPr>
-              <w:t xml:space="preserve">Ranking de productos vendidos (explode de items[])</w:t>
-            </w:r>
-          </w:p>
-        </w:tc>
-      </w:tr>
-      <w:tr>
-        <w:tc>
-          <w:tcPr>
-            <w:tcW w:type="auto" w:w="0"/>
-            <w:tcMar>
-              <w:top w:type="dxa" w:w="80"/>
-              <w:left w:type="dxa" w:w="120"/>
-              <w:bottom w:type="dxa" w:w="80"/>
-              <w:right w:type="dxa" w:w="120"/>
-            </w:tcMar>
-          </w:tcPr>
-          <w:p>
-            <w:r>
-              <w:rPr>
-                <w:b w:val="false"/>
-                <w:bCs w:val="false"/>
-                <w:color w:val="000000"/>
-                <w:sz w:val="20"/>
-                <w:szCs w:val="20"/>
-              </w:rPr>
-              <w:t xml:space="preserve">get_publicaciones_df</w:t>
-            </w:r>
-          </w:p>
-        </w:tc>
-        <w:tc>
-          <w:tcPr>
-            <w:tcW w:type="auto" w:w="0"/>
-            <w:tcMar>
-              <w:top w:type="dxa" w:w="80"/>
-              <w:left w:type="dxa" w:w="120"/>
-              <w:bottom w:type="dxa" w:w="80"/>
-              <w:right w:type="dxa" w:w="120"/>
-            </w:tcMar>
-          </w:tcPr>
-          <w:p>
-            <w:r>
-              <w:rPr>
-                <w:b w:val="false"/>
-                <w:bCs w:val="false"/>
-                <w:color w:val="000000"/>
-                <w:sz w:val="20"/>
-                <w:szCs w:val="20"/>
-              </w:rPr>
-              <w:t xml:space="preserve">Engagement del muro social por barbero</w:t>
-            </w:r>
-          </w:p>
-        </w:tc>
-      </w:tr>
-    </w:tbl>
+        <w:t xml:space="preserve">Cada tarjeta que se muestra en pantalla es un documento ya calculado en la colección analytics_insights (modelo AnalyticsInsight): título, mensaje en español sencillo, un valor destacado y a qué rol(es) le corresponde. Laravel solo lee esta colección — no hace cálculo pesado en cada request — y AnalyticsInsightService cachea el resultado 10 minutos por rol para no golpear MongoDB en cada carga de pantalla.</w:t>
+      </w:r>
+    </w:p>
     <w:p>
       <w:pPr>
         <w:pBdr>
@@ -2207,10 +1806,10 @@
           <w:bCs/>
           <w:color w:val="B8860B"/>
         </w:rPr>
-        <w:t xml:space="preserve">Reglas importantes:  </w:t>
-      </w:r>
-      <w:r>
-        <w:t xml:space="preserve"> los estados válidos de cita son 6 (pendiente, confirmada, en_proceso, completada, cancelada, no_asistio); ingreso = precio_cobrado de la cita, nunca cantidad × precio; los campos Decimal128 de MongoDB requieren el helper _num() antes de operarse como float.</w:t>
+        <w:t xml:space="preserve">Regla importante:  </w:t>
+      </w:r>
+      <w:r>
+        <w:t xml:space="preserve"> los estados válidos de una cita son 6 (pendiente, confirmada, en_proceso, completada, cancelada, no_asistio) y el ingreso de una cita es siempre su precio_cobrado, nunca cantidad × precio — cualquier cálculo de negocio en el proyecto respeta estas dos reglas para que los números cuadren entre módulos.</w:t>
       </w:r>
     </w:p>
     <w:p>
@@ -2218,325 +1817,7 @@
         <w:pStyle w:val="Heading2"/>
       </w:pPr>
       <w:r>
-        <w:t xml:space="preserve">3.4 Organización por unidad</w:t>
-      </w:r>
-    </w:p>
-    <w:tbl>
-      <w:tblPr>
-        <w:tblW w:type="dxa" w:w="9560"/>
-        <w:tblBorders>
-          <w:top w:val="single" w:color="auto" w:sz="4"/>
-          <w:left w:val="single" w:color="auto" w:sz="4"/>
-          <w:bottom w:val="single" w:color="auto" w:sz="4"/>
-          <w:right w:val="single" w:color="auto" w:sz="4"/>
-          <w:insideH w:val="single" w:color="auto" w:sz="4"/>
-          <w:insideV w:val="single" w:color="auto" w:sz="4"/>
-        </w:tblBorders>
-      </w:tblPr>
-      <w:tblGrid>
-        <w:gridCol w:w="2600"/>
-        <w:gridCol w:w="6960"/>
-      </w:tblGrid>
-      <w:tr>
-        <w:trPr>
-          <w:tblHeader/>
-        </w:trPr>
-        <w:tc>
-          <w:tcPr>
-            <w:tcW w:type="auto" w:w="0"/>
-            <w:shd w:fill="1A1A1A" w:val="clear"/>
-            <w:tcMar>
-              <w:top w:type="dxa" w:w="80"/>
-              <w:left w:type="dxa" w:w="120"/>
-              <w:bottom w:type="dxa" w:w="80"/>
-              <w:right w:type="dxa" w:w="120"/>
-            </w:tcMar>
-          </w:tcPr>
-          <w:p>
-            <w:r>
-              <w:rPr>
-                <w:b/>
-                <w:bCs/>
-                <w:color w:val="FFFFFF"/>
-                <w:sz w:val="20"/>
-                <w:szCs w:val="20"/>
-              </w:rPr>
-              <w:t xml:space="preserve">Carpeta</w:t>
-            </w:r>
-          </w:p>
-        </w:tc>
-        <w:tc>
-          <w:tcPr>
-            <w:tcW w:type="auto" w:w="0"/>
-            <w:shd w:fill="1A1A1A" w:val="clear"/>
-            <w:tcMar>
-              <w:top w:type="dxa" w:w="80"/>
-              <w:left w:type="dxa" w:w="120"/>
-              <w:bottom w:type="dxa" w:w="80"/>
-              <w:right w:type="dxa" w:w="120"/>
-            </w:tcMar>
-          </w:tcPr>
-          <w:p>
-            <w:r>
-              <w:rPr>
-                <w:b/>
-                <w:bCs/>
-                <w:color w:val="FFFFFF"/>
-                <w:sz w:val="20"/>
-                <w:szCs w:val="20"/>
-              </w:rPr>
-              <w:t xml:space="preserve">Contenido</w:t>
-            </w:r>
-          </w:p>
-        </w:tc>
-      </w:tr>
-      <w:tr>
-        <w:tc>
-          <w:tcPr>
-            <w:tcW w:type="auto" w:w="0"/>
-            <w:tcMar>
-              <w:top w:type="dxa" w:w="80"/>
-              <w:left w:type="dxa" w:w="120"/>
-              <w:bottom w:type="dxa" w:w="80"/>
-              <w:right w:type="dxa" w:w="120"/>
-            </w:tcMar>
-          </w:tcPr>
-          <w:p>
-            <w:r>
-              <w:rPr>
-                <w:b w:val="false"/>
-                <w:bCs w:val="false"/>
-                <w:color w:val="000000"/>
-                <w:sz w:val="20"/>
-                <w:szCs w:val="20"/>
-              </w:rPr>
-              <w:t xml:space="preserve">unidad_1_introduccion/</w:t>
-            </w:r>
-          </w:p>
-        </w:tc>
-        <w:tc>
-          <w:tcPr>
-            <w:tcW w:type="auto" w:w="0"/>
-            <w:tcMar>
-              <w:top w:type="dxa" w:w="80"/>
-              <w:left w:type="dxa" w:w="120"/>
-              <w:bottom w:type="dxa" w:w="80"/>
-              <w:right w:type="dxa" w:w="120"/>
-            </w:tcMar>
-          </w:tcPr>
-          <w:p>
-            <w:r>
-              <w:rPr>
-                <w:b w:val="false"/>
-                <w:bCs w:val="false"/>
-                <w:color w:val="000000"/>
-                <w:sz w:val="20"/>
-                <w:szCs w:val="20"/>
-              </w:rPr>
-              <w:t xml:space="preserve">Comparativa y caso de estudio (documentación)</w:t>
-            </w:r>
-          </w:p>
-        </w:tc>
-      </w:tr>
-      <w:tr>
-        <w:tc>
-          <w:tcPr>
-            <w:tcW w:type="auto" w:w="0"/>
-            <w:tcMar>
-              <w:top w:type="dxa" w:w="80"/>
-              <w:left w:type="dxa" w:w="120"/>
-              <w:bottom w:type="dxa" w:w="80"/>
-              <w:right w:type="dxa" w:w="120"/>
-            </w:tcMar>
-          </w:tcPr>
-          <w:p>
-            <w:r>
-              <w:rPr>
-                <w:b w:val="false"/>
-                <w:bCs w:val="false"/>
-                <w:color w:val="000000"/>
-                <w:sz w:val="20"/>
-                <w:szCs w:val="20"/>
-              </w:rPr>
-              <w:t xml:space="preserve">unidad_2_preparacion/</w:t>
-            </w:r>
-          </w:p>
-        </w:tc>
-        <w:tc>
-          <w:tcPr>
-            <w:tcW w:type="auto" w:w="0"/>
-            <w:tcMar>
-              <w:top w:type="dxa" w:w="80"/>
-              <w:left w:type="dxa" w:w="120"/>
-              <w:bottom w:type="dxa" w:w="80"/>
-              <w:right w:type="dxa" w:w="120"/>
-            </w:tcMar>
-          </w:tcPr>
-          <w:p>
-            <w:r>
-              <w:rPr>
-                <w:b w:val="false"/>
-                <w:bCs w:val="false"/>
-                <w:color w:val="000000"/>
-                <w:sz w:val="20"/>
-                <w:szCs w:val="20"/>
-              </w:rPr>
-              <w:t xml:space="preserve">01-13: tipos de datos, data warehouse, limpieza, minería de patrones, ETL/MapReduce, calidad de pagos, fidelización, utilización de barberos, inventario, pedidos de tienda, engagement social</w:t>
-            </w:r>
-          </w:p>
-        </w:tc>
-      </w:tr>
-      <w:tr>
-        <w:tc>
-          <w:tcPr>
-            <w:tcW w:type="auto" w:w="0"/>
-            <w:tcMar>
-              <w:top w:type="dxa" w:w="80"/>
-              <w:left w:type="dxa" w:w="120"/>
-              <w:bottom w:type="dxa" w:w="80"/>
-              <w:right w:type="dxa" w:w="120"/>
-            </w:tcMar>
-          </w:tcPr>
-          <w:p>
-            <w:r>
-              <w:rPr>
-                <w:b w:val="false"/>
-                <w:bCs w:val="false"/>
-                <w:color w:val="000000"/>
-                <w:sz w:val="20"/>
-                <w:szCs w:val="20"/>
-              </w:rPr>
-              <w:t xml:space="preserve">unidad_3_supervisado/</w:t>
-            </w:r>
-          </w:p>
-        </w:tc>
-        <w:tc>
-          <w:tcPr>
-            <w:tcW w:type="auto" w:w="0"/>
-            <w:tcMar>
-              <w:top w:type="dxa" w:w="80"/>
-              <w:left w:type="dxa" w:w="120"/>
-              <w:bottom w:type="dxa" w:w="80"/>
-              <w:right w:type="dxa" w:w="120"/>
-            </w:tcMar>
-          </w:tcPr>
-          <w:p>
-            <w:r>
-              <w:rPr>
-                <w:b w:val="false"/>
-                <w:bCs w:val="false"/>
-                <w:color w:val="000000"/>
-                <w:sz w:val="20"/>
-                <w:szCs w:val="20"/>
-              </w:rPr>
-              <w:t xml:space="preserve">Regresión (6 modelos), árbol de decisión, bosque aleatorio, red neuronal, predicción de cancelación (churn) y de demanda</w:t>
-            </w:r>
-          </w:p>
-        </w:tc>
-      </w:tr>
-      <w:tr>
-        <w:tc>
-          <w:tcPr>
-            <w:tcW w:type="auto" w:w="0"/>
-            <w:tcMar>
-              <w:top w:type="dxa" w:w="80"/>
-              <w:left w:type="dxa" w:w="120"/>
-              <w:bottom w:type="dxa" w:w="80"/>
-              <w:right w:type="dxa" w:w="120"/>
-            </w:tcMar>
-          </w:tcPr>
-          <w:p>
-            <w:r>
-              <w:rPr>
-                <w:b w:val="false"/>
-                <w:bCs w:val="false"/>
-                <w:color w:val="000000"/>
-                <w:sz w:val="20"/>
-                <w:szCs w:val="20"/>
-              </w:rPr>
-              <w:t xml:space="preserve">unidad_4_no_supervisado/</w:t>
-            </w:r>
-          </w:p>
-        </w:tc>
-        <w:tc>
-          <w:tcPr>
-            <w:tcW w:type="auto" w:w="0"/>
-            <w:tcMar>
-              <w:top w:type="dxa" w:w="80"/>
-              <w:left w:type="dxa" w:w="120"/>
-              <w:bottom w:type="dxa" w:w="80"/>
-              <w:right w:type="dxa" w:w="120"/>
-            </w:tcMar>
-          </w:tcPr>
-          <w:p>
-            <w:r>
-              <w:rPr>
-                <w:b w:val="false"/>
-                <w:bCs w:val="false"/>
-                <w:color w:val="000000"/>
-                <w:sz w:val="20"/>
-                <w:szCs w:val="20"/>
-              </w:rPr>
-              <w:t xml:space="preserve">KMeans, PCA, segmentación de clientes, motor de recomendación</w:t>
-            </w:r>
-          </w:p>
-        </w:tc>
-      </w:tr>
-      <w:tr>
-        <w:tc>
-          <w:tcPr>
-            <w:tcW w:type="auto" w:w="0"/>
-            <w:tcMar>
-              <w:top w:type="dxa" w:w="80"/>
-              <w:left w:type="dxa" w:w="120"/>
-              <w:bottom w:type="dxa" w:w="80"/>
-              <w:right w:type="dxa" w:w="120"/>
-            </w:tcMar>
-          </w:tcPr>
-          <w:p>
-            <w:r>
-              <w:rPr>
-                <w:b w:val="false"/>
-                <w:bCs w:val="false"/>
-                <w:color w:val="000000"/>
-                <w:sz w:val="20"/>
-                <w:szCs w:val="20"/>
-              </w:rPr>
-              <w:t xml:space="preserve">unidad_5_visualizacion/</w:t>
-            </w:r>
-          </w:p>
-        </w:tc>
-        <w:tc>
-          <w:tcPr>
-            <w:tcW w:type="auto" w:w="0"/>
-            <w:tcMar>
-              <w:top w:type="dxa" w:w="80"/>
-              <w:left w:type="dxa" w:w="120"/>
-              <w:bottom w:type="dxa" w:w="80"/>
-              <w:right w:type="dxa" w:w="120"/>
-            </w:tcMar>
-          </w:tcPr>
-          <w:p>
-            <w:r>
-              <w:rPr>
-                <w:b w:val="false"/>
-                <w:bCs w:val="false"/>
-                <w:color w:val="000000"/>
-                <w:sz w:val="20"/>
-                <w:szCs w:val="20"/>
-              </w:rPr>
-              <w:t xml:space="preserve">main_dashboard.py (dashboard ejecutivo, 15 pestañas) + dashboards individuales por tema</w:t>
-            </w:r>
-          </w:p>
-        </w:tc>
-      </w:tr>
-    </w:tbl>
-    <w:p>
-      <w:pPr>
-        <w:pStyle w:val="Heading2"/>
-      </w:pPr>
-      <w:r>
-        <w:t xml:space="preserve">3.5 Dashboard ejecutivo</w:t>
+        <w:t xml:space="preserve">3.4 Vista por pestañas</w:t>
       </w:r>
     </w:p>
     <w:p>
@@ -2544,7 +1825,7 @@
         <w:spacing w:after="160"/>
       </w:pPr>
       <w:r>
-        <w:t xml:space="preserve">unidades/unidad_5_visualizacion/main_dashboard.py es el tablero principal: carga los datos una sola vez por sesión, entrena los modelos de ML bajo demanda, y organiza el contenido en pestañas agrupadas por unidad (selector en el sidebar). Incluye desde el resumen ejecutivo del negocio hasta modelos predictivos y segmentación de clientes — incluyendo pedidos de tienda y engagement del muro social.</w:t>
+        <w:t xml:space="preserve">La vista (resources/views/analytics/index.blade.php) organiza las secciones de la 3.2 en pestañas dentro de la misma pantalla, con un acento de color distinto por sección para que sea fácil de escanear visualmente. El componente analytics-insights.blade.php dibuja cada tarjeta de hallazgo de forma consistente sin importar de qué sección venga.</w:t>
       </w:r>
     </w:p>
     <w:p>
@@ -2597,7 +1878,7 @@
           <w:sz w:val="20"/>
           <w:szCs w:val="20"/>
         </w:rPr>
-        <w:t xml:space="preserve">Dashboard ejecutivo de Spark — pestaña "Resumen Ejecutivo" con los KPIs principales.</w:t>
+        <w:t xml:space="preserve">Página de Analítica — pestaña "Resumen ejecutivo" con los KPIs principales.</w:t>
       </w:r>
     </w:p>
     <w:p>
@@ -2650,15 +1931,15 @@
           <w:sz w:val="20"/>
           <w:szCs w:val="20"/>
         </w:rPr>
-        <w:t xml:space="preserve">Dashboard ejecutivo de Spark — pestaña "Tienda y Pedidos" o "Publicaciones" (nuevas).</w:t>
-      </w:r>
-    </w:p>
-    <w:p>
-      <w:pPr>
-        <w:pStyle w:val="Heading2"/>
-      </w:pPr>
-      <w:r>
-        <w:t xml:space="preserve">3.6 Cómo ejecutarlo</w:t>
+        <w:t xml:space="preserve">Página de Analítica — pestaña "Clientes y ventas" u "Operación y equipo".</w:t>
+      </w:r>
+    </w:p>
+    <w:p>
+      <w:pPr>
+        <w:pStyle w:val="Heading1"/>
+      </w:pPr>
+      <w:r>
+        <w:t xml:space="preserve">4. Integración entre la app y el módulo de analítica</w:t>
       </w:r>
     </w:p>
     <w:p>
@@ -2666,420 +1947,9 @@
         <w:spacing w:after="160"/>
       </w:pPr>
       <w:r>
-        <w:t xml:space="preserve">Todo corre en WSL Ubuntu con el entorno conda spark_env activado:</w:t>
-      </w:r>
-    </w:p>
-    <w:p>
-      <w:pPr>
-        <w:shd w:fill="1A1A1A" w:val="clear"/>
-        <w:spacing w:after="240" w:before="120"/>
-      </w:pPr>
-      <w:r>
-        <w:rPr>
-          <w:rFonts w:ascii="Consolas" w:cs="Consolas" w:eastAsia="Consolas" w:hAnsi="Consolas"/>
-          <w:color w:val="E5E5E5"/>
-          <w:sz w:val="18"/>
-          <w:szCs w:val="18"/>
-        </w:rPr>
-        <w:t xml:space="preserve">wsl -d Ubuntu
-conda activate spark_env
-cd /mnt/c/Users/.../UrbanBlade/spark
-# Un script individual
-spark-submit --master local[*] unidades/unidad_2_preparacion/12_pedidos_tienda.py
-# El dashboard ejecutivo
-streamlit run unidades/unidad_5_visualizacion/main_dashboard.py</w:t>
-      </w:r>
-    </w:p>
-    <w:p>
-      <w:pPr>
-        <w:spacing w:after="160"/>
-      </w:pPr>
-      <w:r>
-        <w:t xml:space="preserve">Requiere un archivo .env en la raíz de spark/ con las 5 variables de conexión a MongoDB Atlas (MONGO_USER, MONGO_PASSWORD, MONGO_CLUSTER, MONGO_DB, MONGO_COLLECTION) — nunca una sola MONGO_URI.</w:t>
-      </w:r>
-    </w:p>
-    <w:p>
-      <w:pPr>
-        <w:pBdr>
-          <w:top w:val="dashed" w:color="999999" w:sz="8" w:space="8"/>
-          <w:bottom w:val="dashed" w:color="999999" w:sz="8" w:space="8"/>
-          <w:left w:val="dashed" w:color="999999" w:sz="8" w:space="8"/>
-          <w:right w:val="dashed" w:color="999999" w:sz="8" w:space="8"/>
-        </w:pBdr>
-        <w:shd w:fill="F2F2F2" w:val="clear"/>
-        <w:spacing w:after="60" w:before="200"/>
-        <w:jc w:val="center"/>
-      </w:pPr>
-      <w:r>
-        <w:br/>
-        <w:br/>
-        <w:br/>
-        <w:br/>
-        <w:t xml:space="preserve"/>
-      </w:r>
-      <w:r>
-        <w:rPr>
-          <w:b/>
-          <w:bCs/>
-          <w:color w:val="666666"/>
-          <w:sz w:val="20"/>
-          <w:szCs w:val="20"/>
-        </w:rPr>
-        <w:t xml:space="preserve">📷  ESPACIO PARA CAPTURA DE PANTALLA</w:t>
-      </w:r>
-      <w:r>
-        <w:br/>
-        <w:br/>
-        <w:br/>
-        <w:br/>
-        <w:t xml:space="preserve"/>
-      </w:r>
-    </w:p>
-    <w:p>
-      <w:pPr>
-        <w:spacing w:after="260"/>
-        <w:jc w:val="center"/>
-      </w:pPr>
-      <w:r>
-        <w:rPr>
-          <w:i/>
-          <w:iCs/>
-          <w:color w:val="666666"/>
-          <w:sz w:val="20"/>
-          <w:szCs w:val="20"/>
-        </w:rPr>
-        <w:t xml:space="preserve">Terminal de WSL mostrando la ejecución exitosa de un script (spark-submit) contra datos reales.</w:t>
-      </w:r>
-    </w:p>
-    <w:p>
-      <w:r>
-        <w:br w:type="page"/>
-      </w:r>
-    </w:p>
-    <w:p>
-      <w:pPr>
-        <w:pStyle w:val="Heading1"/>
-      </w:pPr>
-      <w:r>
-        <w:t xml:space="preserve">4. Relación entre los dos proyectos</w:t>
-      </w:r>
-    </w:p>
-    <w:p>
-      <w:pPr>
-        <w:spacing w:after="160"/>
-      </w:pPr>
-      <w:r>
-        <w:t xml:space="preserve">spark/ nunca escribe en la base de datos de producción — es puramente analítico. Cualquier cambio de esquema en barber/ (nuevos campos, nuevas colecciones, cambio de estados) debe reflejarse manualmente en mongo_spark_conexion_sinnulos.py para que el análisis siga siendo correcto; esto ya ocurrió una vez en este proyecto (la ampliación de 4 a 6 estados de cita, y la incorporación de orders/works/comments/reactions al análisis, antes vacías).</w:t>
-      </w:r>
-    </w:p>
-    <w:tbl>
-      <w:tblPr>
-        <w:tblW w:type="dxa" w:w="9360"/>
-        <w:tblBorders>
-          <w:top w:val="single" w:color="auto" w:sz="4"/>
-          <w:left w:val="single" w:color="auto" w:sz="4"/>
-          <w:bottom w:val="single" w:color="auto" w:sz="4"/>
-          <w:right w:val="single" w:color="auto" w:sz="4"/>
-          <w:insideH w:val="single" w:color="auto" w:sz="4"/>
-          <w:insideV w:val="single" w:color="auto" w:sz="4"/>
-        </w:tblBorders>
-      </w:tblPr>
-      <w:tblGrid>
-        <w:gridCol w:w="2200"/>
-        <w:gridCol w:w="3600"/>
-        <w:gridCol w:w="3560"/>
-      </w:tblGrid>
-      <w:tr>
-        <w:trPr>
-          <w:tblHeader/>
-        </w:trPr>
-        <w:tc>
-          <w:tcPr>
-            <w:tcW w:type="auto" w:w="0"/>
-            <w:shd w:fill="1A1A1A" w:val="clear"/>
-            <w:tcMar>
-              <w:top w:type="dxa" w:w="80"/>
-              <w:left w:type="dxa" w:w="120"/>
-              <w:bottom w:type="dxa" w:w="80"/>
-              <w:right w:type="dxa" w:w="120"/>
-            </w:tcMar>
-          </w:tcPr>
-          <w:p>
-            <w:r>
-              <w:rPr>
-                <w:b/>
-                <w:bCs/>
-                <w:color w:val="FFFFFF"/>
-                <w:sz w:val="20"/>
-                <w:szCs w:val="20"/>
-              </w:rPr>
-              <w:t xml:space="preserve"/>
-            </w:r>
-          </w:p>
-        </w:tc>
-        <w:tc>
-          <w:tcPr>
-            <w:tcW w:type="auto" w:w="0"/>
-            <w:shd w:fill="1A1A1A" w:val="clear"/>
-            <w:tcMar>
-              <w:top w:type="dxa" w:w="80"/>
-              <w:left w:type="dxa" w:w="120"/>
-              <w:bottom w:type="dxa" w:w="80"/>
-              <w:right w:type="dxa" w:w="120"/>
-            </w:tcMar>
-          </w:tcPr>
-          <w:p>
-            <w:r>
-              <w:rPr>
-                <w:b/>
-                <w:bCs/>
-                <w:color w:val="FFFFFF"/>
-                <w:sz w:val="20"/>
-                <w:szCs w:val="20"/>
-              </w:rPr>
-              <w:t xml:space="preserve">barber/ (Laravel)</w:t>
-            </w:r>
-          </w:p>
-        </w:tc>
-        <w:tc>
-          <w:tcPr>
-            <w:tcW w:type="auto" w:w="0"/>
-            <w:shd w:fill="1A1A1A" w:val="clear"/>
-            <w:tcMar>
-              <w:top w:type="dxa" w:w="80"/>
-              <w:left w:type="dxa" w:w="120"/>
-              <w:bottom w:type="dxa" w:w="80"/>
-              <w:right w:type="dxa" w:w="120"/>
-            </w:tcMar>
-          </w:tcPr>
-          <w:p>
-            <w:r>
-              <w:rPr>
-                <w:b/>
-                <w:bCs/>
-                <w:color w:val="FFFFFF"/>
-                <w:sz w:val="20"/>
-                <w:szCs w:val="20"/>
-              </w:rPr>
-              <w:t xml:space="preserve">spark/ (PySpark)</w:t>
-            </w:r>
-          </w:p>
-        </w:tc>
-      </w:tr>
-      <w:tr>
-        <w:tc>
-          <w:tcPr>
-            <w:tcW w:type="auto" w:w="0"/>
-            <w:tcMar>
-              <w:top w:type="dxa" w:w="80"/>
-              <w:left w:type="dxa" w:w="120"/>
-              <w:bottom w:type="dxa" w:w="80"/>
-              <w:right w:type="dxa" w:w="120"/>
-            </w:tcMar>
-          </w:tcPr>
-          <w:p>
-            <w:r>
-              <w:rPr>
-                <w:b w:val="false"/>
-                <w:bCs w:val="false"/>
-                <w:color w:val="000000"/>
-                <w:sz w:val="20"/>
-                <w:szCs w:val="20"/>
-              </w:rPr>
-              <w:t xml:space="preserve">Entorno</w:t>
-            </w:r>
-          </w:p>
-        </w:tc>
-        <w:tc>
-          <w:tcPr>
-            <w:tcW w:type="auto" w:w="0"/>
-            <w:tcMar>
-              <w:top w:type="dxa" w:w="80"/>
-              <w:left w:type="dxa" w:w="120"/>
-              <w:bottom w:type="dxa" w:w="80"/>
-              <w:right w:type="dxa" w:w="120"/>
-            </w:tcMar>
-          </w:tcPr>
-          <w:p>
-            <w:r>
-              <w:rPr>
-                <w:b w:val="false"/>
-                <w:bCs w:val="false"/>
-                <w:color w:val="000000"/>
-                <w:sz w:val="20"/>
-                <w:szCs w:val="20"/>
-              </w:rPr>
-              <w:t xml:space="preserve">Docker</w:t>
-            </w:r>
-          </w:p>
-        </w:tc>
-        <w:tc>
-          <w:tcPr>
-            <w:tcW w:type="auto" w:w="0"/>
-            <w:tcMar>
-              <w:top w:type="dxa" w:w="80"/>
-              <w:left w:type="dxa" w:w="120"/>
-              <w:bottom w:type="dxa" w:w="80"/>
-              <w:right w:type="dxa" w:w="120"/>
-            </w:tcMar>
-          </w:tcPr>
-          <w:p>
-            <w:r>
-              <w:rPr>
-                <w:b w:val="false"/>
-                <w:bCs w:val="false"/>
-                <w:color w:val="000000"/>
-                <w:sz w:val="20"/>
-                <w:szCs w:val="20"/>
-              </w:rPr>
-              <w:t xml:space="preserve">WSL Ubuntu</w:t>
-            </w:r>
-          </w:p>
-        </w:tc>
-      </w:tr>
-      <w:tr>
-        <w:tc>
-          <w:tcPr>
-            <w:tcW w:type="auto" w:w="0"/>
-            <w:tcMar>
-              <w:top w:type="dxa" w:w="80"/>
-              <w:left w:type="dxa" w:w="120"/>
-              <w:bottom w:type="dxa" w:w="80"/>
-              <w:right w:type="dxa" w:w="120"/>
-            </w:tcMar>
-          </w:tcPr>
-          <w:p>
-            <w:r>
-              <w:rPr>
-                <w:b w:val="false"/>
-                <w:bCs w:val="false"/>
-                <w:color w:val="000000"/>
-                <w:sz w:val="20"/>
-                <w:szCs w:val="20"/>
-              </w:rPr>
-              <w:t xml:space="preserve">Acceso a datos</w:t>
-            </w:r>
-          </w:p>
-        </w:tc>
-        <w:tc>
-          <w:tcPr>
-            <w:tcW w:type="auto" w:w="0"/>
-            <w:tcMar>
-              <w:top w:type="dxa" w:w="80"/>
-              <w:left w:type="dxa" w:w="120"/>
-              <w:bottom w:type="dxa" w:w="80"/>
-              <w:right w:type="dxa" w:w="120"/>
-            </w:tcMar>
-          </w:tcPr>
-          <w:p>
-            <w:r>
-              <w:rPr>
-                <w:b w:val="false"/>
-                <w:bCs w:val="false"/>
-                <w:color w:val="000000"/>
-                <w:sz w:val="20"/>
-                <w:szCs w:val="20"/>
-              </w:rPr>
-              <w:t xml:space="preserve">Lectura y escritura (operación real)</w:t>
-            </w:r>
-          </w:p>
-        </w:tc>
-        <w:tc>
-          <w:tcPr>
-            <w:tcW w:type="auto" w:w="0"/>
-            <w:tcMar>
-              <w:top w:type="dxa" w:w="80"/>
-              <w:left w:type="dxa" w:w="120"/>
-              <w:bottom w:type="dxa" w:w="80"/>
-              <w:right w:type="dxa" w:w="120"/>
-            </w:tcMar>
-          </w:tcPr>
-          <w:p>
-            <w:r>
-              <w:rPr>
-                <w:b w:val="false"/>
-                <w:bCs w:val="false"/>
-                <w:color w:val="000000"/>
-                <w:sz w:val="20"/>
-                <w:szCs w:val="20"/>
-              </w:rPr>
-              <w:t xml:space="preserve">Solo lectura (análisis)</w:t>
-            </w:r>
-          </w:p>
-        </w:tc>
-      </w:tr>
-      <w:tr>
-        <w:tc>
-          <w:tcPr>
-            <w:tcW w:type="auto" w:w="0"/>
-            <w:tcMar>
-              <w:top w:type="dxa" w:w="80"/>
-              <w:left w:type="dxa" w:w="120"/>
-              <w:bottom w:type="dxa" w:w="80"/>
-              <w:right w:type="dxa" w:w="120"/>
-            </w:tcMar>
-          </w:tcPr>
-          <w:p>
-            <w:r>
-              <w:rPr>
-                <w:b w:val="false"/>
-                <w:bCs w:val="false"/>
-                <w:color w:val="000000"/>
-                <w:sz w:val="20"/>
-                <w:szCs w:val="20"/>
-              </w:rPr>
-              <w:t xml:space="preserve">Propósito</w:t>
-            </w:r>
-          </w:p>
-        </w:tc>
-        <w:tc>
-          <w:tcPr>
-            <w:tcW w:type="auto" w:w="0"/>
-            <w:tcMar>
-              <w:top w:type="dxa" w:w="80"/>
-              <w:left w:type="dxa" w:w="120"/>
-              <w:bottom w:type="dxa" w:w="80"/>
-              <w:right w:type="dxa" w:w="120"/>
-            </w:tcMar>
-          </w:tcPr>
-          <w:p>
-            <w:r>
-              <w:rPr>
-                <w:b w:val="false"/>
-                <w:bCs w:val="false"/>
-                <w:color w:val="000000"/>
-                <w:sz w:val="20"/>
-                <w:szCs w:val="20"/>
-              </w:rPr>
-              <w:t xml:space="preserve">Operar el negocio día a día</w:t>
-            </w:r>
-          </w:p>
-        </w:tc>
-        <w:tc>
-          <w:tcPr>
-            <w:tcW w:type="auto" w:w="0"/>
-            <w:tcMar>
-              <w:top w:type="dxa" w:w="80"/>
-              <w:left w:type="dxa" w:w="120"/>
-              <w:bottom w:type="dxa" w:w="80"/>
-              <w:right w:type="dxa" w:w="120"/>
-            </w:tcMar>
-          </w:tcPr>
-          <w:p>
-            <w:r>
-              <w:rPr>
-                <w:b w:val="false"/>
-                <w:bCs w:val="false"/>
-                <w:color w:val="000000"/>
-                <w:sz w:val="20"/>
-                <w:szCs w:val="20"/>
-              </w:rPr>
-              <w:t xml:space="preserve">Analítica y visualización avanzada</w:t>
-            </w:r>
-          </w:p>
-        </w:tc>
-      </w:tr>
-    </w:tbl>
+        <w:t xml:space="preserve">El módulo de analítica solo lee de la base de datos — nunca escribe en las colecciones operativas (citas, pagos, clientes, etc.), es puramente de consulta. Cualquier cambio de esquema en el resto de la app (nuevos campos, nuevas colecciones, cambio de estados) debe reflejarse en la lógica que llena analytics_insights para que los hallazgos sigan siendo correctos; esto ya ocurrió una vez (la ampliación de 4 a 6 estados de cita, y la incorporación de orders/works/comments/reactions al análisis, antes vacías).</w:t>
+      </w:r>
+    </w:p>
     <w:sectPr>
       <w:headerReference w:type="default" r:id="rId7"/>
       <w:footerReference w:type="default" r:id="rId8"/>

</xml_diff>